<commit_message>
status: update HTML version
</commit_message>
<xml_diff>
--- a/docs/manuscript/index.docx
+++ b/docs/manuscript/index.docx
@@ -47,7 +47,7 @@
         <w:pStyle w:val="Date"/>
       </w:pPr>
       <w:r>
-        <w:t xml:space="preserve">2026-07-16</w:t>
+        <w:t xml:space="preserve">2026-08-13</w:t>
       </w:r>
     </w:p>
     <w:p>
@@ -11125,25 +11125,63 @@
         <w:t xml:space="preserve">]</w:t>
       </w:r>
       <w:r>
-        <w:t xml:space="preserve">,</w:t>
-      </w:r>
-      <w:r>
-        <w:t xml:space="preserve"> </w:t>
-      </w:r>
-      <w:r>
-        <w:t xml:space="preserve">suppressing both the magnitude and variability of skin temperature</w:t>
-      </w:r>
-      <w:r>
-        <w:t xml:space="preserve"> </w:t>
-      </w:r>
-      <w:r>
-        <w:t xml:space="preserve">changes and making it less likely that occupants cross discomfort</w:t>
-      </w:r>
-      <w:r>
-        <w:t xml:space="preserve"> </w:t>
-      </w:r>
-      <w:r>
-        <w:t xml:space="preserve">thresholds.</w:t>
+        <w:t xml:space="preserve">. It</w:t>
+      </w:r>
+      <w:r>
+        <w:t xml:space="preserve"> </w:t>
+      </w:r>
+      <w:r>
+        <w:t xml:space="preserve">should be noted that the clothing insulation of 0.75 clo in this study</w:t>
+      </w:r>
+      <w:r>
+        <w:t xml:space="preserve"> </w:t>
+      </w:r>
+      <w:r>
+        <w:t xml:space="preserve">represents the whole-body ensemble, whereas the local insulation at the</w:t>
+      </w:r>
+      <w:r>
+        <w:t xml:space="preserve"> </w:t>
+      </w:r>
+      <w:r>
+        <w:t xml:space="preserve">ankle was provided by thin socks (approximately 0.02 clo</w:t>
+      </w:r>
+      <w:r>
+        <w:t xml:space="preserve"> </w:t>
+      </w:r>
+      <w:r>
+        <w:t xml:space="preserve">[</w:t>
+      </w:r>
+      <w:hyperlink w:anchor="ref-ashraeANSIASHRAEStandard2023">
+        <w:r>
+          <w:rPr>
+            <w:rStyle w:val="Hyperlink"/>
+          </w:rPr>
+          <w:t xml:space="preserve">8</w:t>
+        </w:r>
+      </w:hyperlink>
+      <w:r>
+        <w:t xml:space="preserve">]</w:t>
+      </w:r>
+      <w:r>
+        <w:t xml:space="preserve">). Despite this low local insulation, we</w:t>
+      </w:r>
+      <w:r>
+        <w:t xml:space="preserve"> </w:t>
+      </w:r>
+      <w:r>
+        <w:t xml:space="preserve">observed that ankle coverage still suppressed both the mxagnitude and</w:t>
+      </w:r>
+      <w:r>
+        <w:t xml:space="preserve"> </w:t>
+      </w:r>
+      <w:r>
+        <w:t xml:space="preserve">variability of skin temperature changes and made it less likely that</w:t>
+      </w:r>
+      <w:r>
+        <w:t xml:space="preserve"> </w:t>
+      </w:r>
+      <w:r>
+        <w:t xml:space="preserve">occupants cross discomfort thresholds.</w:t>
       </w:r>
     </w:p>
     <w:p>

</xml_diff>